<commit_message>
Update inference API, signbridge-app UI, and training utilities for new domain models
- Rework signbridge-app Flask backend (app.py) and template UI to support multi-model selection across the new domain bundles; bundle MediaPipe pose/hands vendor assets in static/ for offline browser inference
- Refresh inference API and model registry to enumerate the expanded production-models set
- Update OpenHands modernized inference utility and ASL training script for the new model variants
- Add pose handedness metadata generator and resulting handedness_metadata.json
- Update show-and-tell app, camera processor, and demo samples
- Update closed-captions video pipeline
- Add pyrightconfig.json and research notes (active glosses, project structure)
- Refresh lab notebook and research tables
</commit_message>
<xml_diff>
--- a/project-utilities/evaluation_metrics/research_charts/Tables.docx
+++ b/project-utilities/evaluation_metrics/research_charts/Tables.docx
@@ -1653,16 +1653,7 @@
                 <w:sz w:val="20"/>
                 <w:szCs w:val="20"/>
               </w:rPr>
-              <w:t xml:space="preserve">[1.4] </w:t>
-            </w:r>
-            <w:r>
-              <w:rPr>
-                <w:rFonts w:ascii="Times New Roman" w:eastAsia="Times New Roman" w:hAnsi="Times New Roman" w:cs="Times New Roman"/>
-                <w:color w:val="BF4E14" w:themeColor="accent2" w:themeShade="BF"/>
-                <w:sz w:val="20"/>
-                <w:szCs w:val="20"/>
-              </w:rPr>
-              <w:t xml:space="preserve">+ 83 keypoints </w:t>
+              <w:t xml:space="preserve">[1.4] + 83 keypoints </w:t>
             </w:r>
           </w:p>
         </w:tc>
@@ -1764,34 +1755,7 @@
                 <w:sz w:val="20"/>
                 <w:szCs w:val="20"/>
               </w:rPr>
-              <w:t>50</w:t>
-            </w:r>
-            <w:r>
-              <w:rPr>
-                <w:rFonts w:ascii="Times New Roman" w:eastAsia="Times New Roman" w:hAnsi="Times New Roman" w:cs="Times New Roman"/>
-                <w:color w:val="BF4E14" w:themeColor="accent2" w:themeShade="BF"/>
-                <w:sz w:val="20"/>
-                <w:szCs w:val="20"/>
-              </w:rPr>
-              <w:t>.</w:t>
-            </w:r>
-            <w:r>
-              <w:rPr>
-                <w:rFonts w:ascii="Times New Roman" w:eastAsia="Times New Roman" w:hAnsi="Times New Roman" w:cs="Times New Roman"/>
-                <w:color w:val="BF4E14" w:themeColor="accent2" w:themeShade="BF"/>
-                <w:sz w:val="20"/>
-                <w:szCs w:val="20"/>
-              </w:rPr>
-              <w:t>33</w:t>
-            </w:r>
-            <w:r>
-              <w:rPr>
-                <w:rFonts w:ascii="Times New Roman" w:eastAsia="Times New Roman" w:hAnsi="Times New Roman" w:cs="Times New Roman"/>
-                <w:color w:val="BF4E14" w:themeColor="accent2" w:themeShade="BF"/>
-                <w:sz w:val="20"/>
-                <w:szCs w:val="20"/>
-              </w:rPr>
-              <w:t>%</w:t>
+              <w:t>50.33%</w:t>
             </w:r>
           </w:p>
         </w:tc>
@@ -1825,34 +1789,7 @@
                 <w:sz w:val="20"/>
                 <w:szCs w:val="20"/>
               </w:rPr>
-              <w:t>71</w:t>
-            </w:r>
-            <w:r>
-              <w:rPr>
-                <w:rFonts w:ascii="Times New Roman" w:eastAsia="Times New Roman" w:hAnsi="Times New Roman" w:cs="Times New Roman"/>
-                <w:color w:val="BF4E14" w:themeColor="accent2" w:themeShade="BF"/>
-                <w:sz w:val="20"/>
-                <w:szCs w:val="20"/>
-              </w:rPr>
-              <w:t>.2</w:t>
-            </w:r>
-            <w:r>
-              <w:rPr>
-                <w:rFonts w:ascii="Times New Roman" w:eastAsia="Times New Roman" w:hAnsi="Times New Roman" w:cs="Times New Roman"/>
-                <w:color w:val="BF4E14" w:themeColor="accent2" w:themeShade="BF"/>
-                <w:sz w:val="20"/>
-                <w:szCs w:val="20"/>
-              </w:rPr>
-              <w:t>6</w:t>
-            </w:r>
-            <w:r>
-              <w:rPr>
-                <w:rFonts w:ascii="Times New Roman" w:eastAsia="Times New Roman" w:hAnsi="Times New Roman" w:cs="Times New Roman"/>
-                <w:color w:val="BF4E14" w:themeColor="accent2" w:themeShade="BF"/>
-                <w:sz w:val="20"/>
-                <w:szCs w:val="20"/>
-              </w:rPr>
-              <w:t>%</w:t>
+              <w:t>71.26%</w:t>
             </w:r>
           </w:p>
         </w:tc>
@@ -2073,15 +2010,7 @@
                 <w:szCs w:val="20"/>
               </w:rPr>
               <w:lastRenderedPageBreak/>
-              <w:t xml:space="preserve">[1.6] 83 keypoints </w:t>
-            </w:r>
-            <w:r>
-              <w:rPr>
-                <w:rFonts w:ascii="Times New Roman" w:eastAsia="Times New Roman" w:hAnsi="Times New Roman" w:cs="Times New Roman"/>
-                <w:sz w:val="20"/>
-                <w:szCs w:val="20"/>
-              </w:rPr>
-              <w:t>+ Fingermarks</w:t>
+              <w:t>[1.6] 83 keypoints + Fingermarks</w:t>
             </w:r>
           </w:p>
         </w:tc>
@@ -2623,43 +2552,7 @@
                 <w:sz w:val="20"/>
                 <w:szCs w:val="20"/>
               </w:rPr>
-              <w:t>[2.</w:t>
-            </w:r>
-            <w:r>
-              <w:rPr>
-                <w:rFonts w:ascii="Times New Roman" w:eastAsia="Times New Roman" w:hAnsi="Times New Roman" w:cs="Times New Roman"/>
-                <w:color w:val="BF4E14" w:themeColor="accent2" w:themeShade="BF"/>
-                <w:sz w:val="20"/>
-                <w:szCs w:val="20"/>
-              </w:rPr>
-              <w:t>2</w:t>
-            </w:r>
-            <w:r>
-              <w:rPr>
-                <w:rFonts w:ascii="Times New Roman" w:eastAsia="Times New Roman" w:hAnsi="Times New Roman" w:cs="Times New Roman"/>
-                <w:color w:val="BF4E14" w:themeColor="accent2" w:themeShade="BF"/>
-                <w:sz w:val="20"/>
-                <w:szCs w:val="20"/>
-              </w:rPr>
-              <w:t xml:space="preserve">] + </w:t>
-            </w:r>
-            <w:r>
-              <w:rPr>
-                <w:rFonts w:ascii="Times New Roman" w:eastAsia="Times New Roman" w:hAnsi="Times New Roman" w:cs="Times New Roman"/>
-                <w:color w:val="BF4E14" w:themeColor="accent2" w:themeShade="BF"/>
-                <w:sz w:val="20"/>
-                <w:szCs w:val="20"/>
-              </w:rPr>
-              <w:t>65</w:t>
-            </w:r>
-            <w:r>
-              <w:rPr>
-                <w:rFonts w:ascii="Times New Roman" w:eastAsia="Times New Roman" w:hAnsi="Times New Roman" w:cs="Times New Roman"/>
-                <w:color w:val="BF4E14" w:themeColor="accent2" w:themeShade="BF"/>
-                <w:sz w:val="20"/>
-                <w:szCs w:val="20"/>
-              </w:rPr>
-              <w:t>x Aug</w:t>
+              <w:t>[2.2] + 65x Aug</w:t>
             </w:r>
           </w:p>
         </w:tc>
@@ -2856,23 +2749,7 @@
                 <w:sz w:val="20"/>
                 <w:szCs w:val="20"/>
               </w:rPr>
-              <w:t xml:space="preserve">[2.2] + </w:t>
-            </w:r>
-            <w:r>
-              <w:rPr>
-                <w:rFonts w:ascii="Times New Roman" w:eastAsia="Times New Roman" w:hAnsi="Times New Roman" w:cs="Times New Roman"/>
-                <w:sz w:val="20"/>
-                <w:szCs w:val="20"/>
-              </w:rPr>
-              <w:t>100</w:t>
-            </w:r>
-            <w:r>
-              <w:rPr>
-                <w:rFonts w:ascii="Times New Roman" w:eastAsia="Times New Roman" w:hAnsi="Times New Roman" w:cs="Times New Roman"/>
-                <w:sz w:val="20"/>
-                <w:szCs w:val="20"/>
-              </w:rPr>
-              <w:t>x Aug</w:t>
+              <w:t>[2.2] + 100x Aug</w:t>
             </w:r>
           </w:p>
         </w:tc>
@@ -2985,23 +2862,7 @@
                 <w:sz w:val="20"/>
                 <w:szCs w:val="20"/>
               </w:rPr>
-              <w:t>.</w:t>
-            </w:r>
-            <w:r>
-              <w:rPr>
-                <w:rFonts w:ascii="Times New Roman" w:eastAsia="Times New Roman" w:hAnsi="Times New Roman" w:cs="Times New Roman"/>
-                <w:sz w:val="20"/>
-                <w:szCs w:val="20"/>
-              </w:rPr>
-              <w:t>60</w:t>
-            </w:r>
-            <w:r>
-              <w:rPr>
-                <w:rFonts w:ascii="Times New Roman" w:eastAsia="Times New Roman" w:hAnsi="Times New Roman" w:cs="Times New Roman"/>
-                <w:sz w:val="20"/>
-                <w:szCs w:val="20"/>
-              </w:rPr>
-              <w:t>%</w:t>
+              <w:t>.60%</w:t>
             </w:r>
           </w:p>
         </w:tc>
@@ -3036,23 +2897,7 @@
                 <w:sz w:val="20"/>
                 <w:szCs w:val="20"/>
               </w:rPr>
-              <w:t>8</w:t>
-            </w:r>
-            <w:r>
-              <w:rPr>
-                <w:rFonts w:ascii="Times New Roman" w:eastAsia="Times New Roman" w:hAnsi="Times New Roman" w:cs="Times New Roman"/>
-                <w:sz w:val="20"/>
-                <w:szCs w:val="20"/>
-              </w:rPr>
-              <w:t>1.86</w:t>
-            </w:r>
-            <w:r>
-              <w:rPr>
-                <w:rFonts w:ascii="Times New Roman" w:eastAsia="Times New Roman" w:hAnsi="Times New Roman" w:cs="Times New Roman"/>
-                <w:sz w:val="20"/>
-                <w:szCs w:val="20"/>
-              </w:rPr>
-              <w:t>%</w:t>
+              <w:t>81.86%</w:t>
             </w:r>
           </w:p>
         </w:tc>
@@ -3390,18 +3235,7 @@
                 <w:sz w:val="20"/>
                 <w:szCs w:val="20"/>
               </w:rPr>
-              <w:t>65</w:t>
-            </w:r>
-            <w:r>
-              <w:rPr>
-                <w:rFonts w:ascii="Times New Roman" w:eastAsia="Times New Roman" w:hAnsi="Times New Roman" w:cs="Times New Roman"/>
-                <w:b/>
-                <w:bCs/>
-                <w:color w:val="BF4E14" w:themeColor="accent2" w:themeShade="BF"/>
-                <w:sz w:val="20"/>
-                <w:szCs w:val="20"/>
-              </w:rPr>
-              <w:t>×</w:t>
+              <w:t>65×</w:t>
             </w:r>
           </w:p>
         </w:tc>
@@ -4059,10 +3893,7 @@
           </w:tcPr>
           <w:p>
             <w:r>
-              <w:t>86</w:t>
-            </w:r>
-            <w:r>
-              <w:t>%</w:t>
+              <w:t>86%</w:t>
             </w:r>
           </w:p>
         </w:tc>
@@ -4184,13 +4015,7 @@
           </w:tcPr>
           <w:p>
             <w:r>
-              <w:t>8</w:t>
-            </w:r>
-            <w:r>
-              <w:t>4</w:t>
-            </w:r>
-            <w:r>
-              <w:t>%</w:t>
+              <w:t>84%</w:t>
             </w:r>
           </w:p>
         </w:tc>
@@ -4270,10 +4095,7 @@
           </w:tcPr>
           <w:p>
             <w:r>
-              <w:t>7</w:t>
-            </w:r>
-            <w:r>
-              <w:t>2</w:t>
+              <w:t>72</w:t>
             </w:r>
             <w:r>
               <w:t>.28</w:t>
@@ -4330,10 +4152,7 @@
           </w:tcPr>
           <w:p>
             <w:r>
-              <w:t>80</w:t>
-            </w:r>
-            <w:r>
-              <w:t>%</w:t>
+              <w:t>80%</w:t>
             </w:r>
           </w:p>
         </w:tc>
@@ -4582,10 +4401,7 @@
           </w:tcPr>
           <w:p>
             <w:r>
-              <w:t>49</w:t>
-            </w:r>
-            <w:r>
-              <w:t>%</w:t>
+              <w:t>49%</w:t>
             </w:r>
           </w:p>
         </w:tc>
@@ -6097,6 +5913,98 @@
         </w:tc>
       </w:tr>
     </w:tbl>
+    <w:p/>
+    <w:p/>
+    <w:p>
+      <w:pPr>
+        <w:numPr>
+          <w:ilvl w:val="0"/>
+          <w:numId w:val="1"/>
+        </w:numPr>
+      </w:pPr>
+      <w:r>
+        <w:t>Video models and 27-point poses miss finger details, making some signs hard to tell apart.</w:t>
+      </w:r>
+    </w:p>
+    <w:p>
+      <w:pPr>
+        <w:numPr>
+          <w:ilvl w:val="0"/>
+          <w:numId w:val="1"/>
+        </w:numPr>
+      </w:pPr>
+      <w:r>
+        <w:t>Accuracy drops a lot if there are fewer than 50 examples per sign.</w:t>
+      </w:r>
+    </w:p>
+    <w:p>
+      <w:pPr>
+        <w:numPr>
+          <w:ilvl w:val="0"/>
+          <w:numId w:val="1"/>
+        </w:numPr>
+      </w:pPr>
+      <w:r>
+        <w:t>Most sign language datasets have less than 50 samples per sign, causing this problem</w:t>
+      </w:r>
+    </w:p>
+    <w:p>
+      <w:r>
+        <w:rPr>
+          <w:noProof/>
+        </w:rPr>
+        <w:lastRenderedPageBreak/>
+        <w:drawing>
+          <wp:inline distT="0" distB="0" distL="0" distR="0" wp14:anchorId="302E93FA" wp14:editId="05EFA96D">
+            <wp:extent cx="5581650" cy="3190875"/>
+            <wp:effectExtent l="0" t="0" r="0" b="9525"/>
+            <wp:docPr id="2" name="Picture 1"/>
+            <wp:cNvGraphicFramePr>
+              <a:graphicFrameLocks xmlns:a="http://schemas.openxmlformats.org/drawingml/2006/main" noChangeAspect="1"/>
+            </wp:cNvGraphicFramePr>
+            <a:graphic xmlns:a="http://schemas.openxmlformats.org/drawingml/2006/main">
+              <a:graphicData uri="http://schemas.openxmlformats.org/drawingml/2006/picture">
+                <pic:pic xmlns:pic="http://schemas.openxmlformats.org/drawingml/2006/picture">
+                  <pic:nvPicPr>
+                    <pic:cNvPr id="0" name="Picture 2"/>
+                    <pic:cNvPicPr>
+                      <a:picLocks noChangeAspect="1" noChangeArrowheads="1"/>
+                    </pic:cNvPicPr>
+                  </pic:nvPicPr>
+                  <pic:blipFill>
+                    <a:blip r:embed="rId5">
+                      <a:extLst>
+                        <a:ext uri="{28A0092B-C50C-407E-A947-70E740481C1C}">
+                          <a14:useLocalDpi xmlns:a14="http://schemas.microsoft.com/office/drawing/2010/main" val="0"/>
+                        </a:ext>
+                      </a:extLst>
+                    </a:blip>
+                    <a:srcRect/>
+                    <a:stretch>
+                      <a:fillRect/>
+                    </a:stretch>
+                  </pic:blipFill>
+                  <pic:spPr bwMode="auto">
+                    <a:xfrm>
+                      <a:off x="0" y="0"/>
+                      <a:ext cx="5581650" cy="3190875"/>
+                    </a:xfrm>
+                    <a:prstGeom prst="rect">
+                      <a:avLst/>
+                    </a:prstGeom>
+                    <a:noFill/>
+                    <a:ln>
+                      <a:noFill/>
+                    </a:ln>
+                  </pic:spPr>
+                </pic:pic>
+              </a:graphicData>
+            </a:graphic>
+          </wp:inline>
+        </w:drawing>
+      </w:r>
+    </w:p>
+    <w:p/>
     <w:p/>
     <w:sectPr>
       <w:pgSz w:w="12240" w:h="15840"/>
@@ -6106,6 +6014,163 @@
     </w:sectPr>
   </w:body>
 </w:document>
+</file>
+
+<file path=word/numbering.xml><?xml version="1.0" encoding="utf-8"?>
+<w:numbering xmlns:wpc="http://schemas.microsoft.com/office/word/2010/wordprocessingCanvas" xmlns:cx="http://schemas.microsoft.com/office/drawing/2014/chartex" xmlns:cx1="http://schemas.microsoft.com/office/drawing/2015/9/8/chartex" xmlns:cx2="http://schemas.microsoft.com/office/drawing/2015/10/21/chartex" xmlns:cx3="http://schemas.microsoft.com/office/drawing/2016/5/9/chartex" xmlns:cx4="http://schemas.microsoft.com/office/drawing/2016/5/10/chartex" xmlns:cx5="http://schemas.microsoft.com/office/drawing/2016/5/11/chartex" xmlns:cx6="http://schemas.microsoft.com/office/drawing/2016/5/12/chartex" xmlns:cx7="http://schemas.microsoft.com/office/drawing/2016/5/13/chartex" xmlns:cx8="http://schemas.microsoft.com/office/drawing/2016/5/14/chartex" xmlns:mc="http://schemas.openxmlformats.org/markup-compatibility/2006" xmlns:aink="http://schemas.microsoft.com/office/drawing/2016/ink" xmlns:am3d="http://schemas.microsoft.com/office/drawing/2017/model3d" xmlns:o="urn:schemas-microsoft-com:office:office" xmlns:oel="http://schemas.microsoft.com/office/2019/extlst" xmlns:r="http://schemas.openxmlformats.org/officeDocument/2006/relationships" xmlns:m="http://schemas.openxmlformats.org/officeDocument/2006/math" xmlns:v="urn:schemas-microsoft-com:vml" xmlns:wp14="http://schemas.microsoft.com/office/word/2010/wordprocessingDrawing" xmlns:wp="http://schemas.openxmlformats.org/drawingml/2006/wordprocessingDrawing" xmlns:w10="urn:schemas-microsoft-com:office:word" xmlns:w="http://schemas.openxmlformats.org/wordprocessingml/2006/main" xmlns:w14="http://schemas.microsoft.com/office/word/2010/wordml" xmlns:w15="http://schemas.microsoft.com/office/word/2012/wordml" xmlns:w16cex="http://schemas.microsoft.com/office/word/2018/wordml/cex" xmlns:w16cid="http://schemas.microsoft.com/office/word/2016/wordml/cid" xmlns:w16="http://schemas.microsoft.com/office/word/2018/wordml" xmlns:w16du="http://schemas.microsoft.com/office/word/2023/wordml/word16du" xmlns:w16sdtdh="http://schemas.microsoft.com/office/word/2020/wordml/sdtdatahash" xmlns:w16sdtfl="http://schemas.microsoft.com/office/word/2024/wordml/sdtformatlock" xmlns:w16se="http://schemas.microsoft.com/office/word/2015/wordml/symex" xmlns:wpg="http://schemas.microsoft.com/office/word/2010/wordprocessingGroup" xmlns:wpi="http://schemas.microsoft.com/office/word/2010/wordprocessingInk" xmlns:wne="http://schemas.microsoft.com/office/word/2006/wordml" xmlns:wps="http://schemas.microsoft.com/office/word/2010/wordprocessingShape" mc:Ignorable="w14 w15 w16se w16cid w16 w16cex w16sdtdh w16sdtfl w16du wp14">
+  <w:abstractNum w:abstractNumId="0" w15:restartNumberingAfterBreak="0">
+    <w:nsid w:val="23F77F2A"/>
+    <w:multiLevelType w:val="multilevel"/>
+    <w:tmpl w:val="9F341128"/>
+    <w:lvl w:ilvl="0">
+      <w:start w:val="1"/>
+      <w:numFmt w:val="bullet"/>
+      <w:lvlText w:val=""/>
+      <w:lvlJc w:val="left"/>
+      <w:pPr>
+        <w:tabs>
+          <w:tab w:val="num" w:pos="720"/>
+        </w:tabs>
+        <w:ind w:left="720" w:hanging="360"/>
+      </w:pPr>
+      <w:rPr>
+        <w:rFonts w:ascii="Symbol" w:hAnsi="Symbol" w:hint="default"/>
+        <w:sz w:val="20"/>
+      </w:rPr>
+    </w:lvl>
+    <w:lvl w:ilvl="1" w:tentative="1">
+      <w:start w:val="1"/>
+      <w:numFmt w:val="bullet"/>
+      <w:lvlText w:val="o"/>
+      <w:lvlJc w:val="left"/>
+      <w:pPr>
+        <w:tabs>
+          <w:tab w:val="num" w:pos="1440"/>
+        </w:tabs>
+        <w:ind w:left="1440" w:hanging="360"/>
+      </w:pPr>
+      <w:rPr>
+        <w:rFonts w:ascii="Courier New" w:hAnsi="Courier New" w:hint="default"/>
+        <w:sz w:val="20"/>
+      </w:rPr>
+    </w:lvl>
+    <w:lvl w:ilvl="2" w:tentative="1">
+      <w:start w:val="1"/>
+      <w:numFmt w:val="bullet"/>
+      <w:lvlText w:val=""/>
+      <w:lvlJc w:val="left"/>
+      <w:pPr>
+        <w:tabs>
+          <w:tab w:val="num" w:pos="2160"/>
+        </w:tabs>
+        <w:ind w:left="2160" w:hanging="360"/>
+      </w:pPr>
+      <w:rPr>
+        <w:rFonts w:ascii="Wingdings" w:hAnsi="Wingdings" w:hint="default"/>
+        <w:sz w:val="20"/>
+      </w:rPr>
+    </w:lvl>
+    <w:lvl w:ilvl="3" w:tentative="1">
+      <w:start w:val="1"/>
+      <w:numFmt w:val="bullet"/>
+      <w:lvlText w:val=""/>
+      <w:lvlJc w:val="left"/>
+      <w:pPr>
+        <w:tabs>
+          <w:tab w:val="num" w:pos="2880"/>
+        </w:tabs>
+        <w:ind w:left="2880" w:hanging="360"/>
+      </w:pPr>
+      <w:rPr>
+        <w:rFonts w:ascii="Wingdings" w:hAnsi="Wingdings" w:hint="default"/>
+        <w:sz w:val="20"/>
+      </w:rPr>
+    </w:lvl>
+    <w:lvl w:ilvl="4" w:tentative="1">
+      <w:start w:val="1"/>
+      <w:numFmt w:val="bullet"/>
+      <w:lvlText w:val=""/>
+      <w:lvlJc w:val="left"/>
+      <w:pPr>
+        <w:tabs>
+          <w:tab w:val="num" w:pos="3600"/>
+        </w:tabs>
+        <w:ind w:left="3600" w:hanging="360"/>
+      </w:pPr>
+      <w:rPr>
+        <w:rFonts w:ascii="Wingdings" w:hAnsi="Wingdings" w:hint="default"/>
+        <w:sz w:val="20"/>
+      </w:rPr>
+    </w:lvl>
+    <w:lvl w:ilvl="5" w:tentative="1">
+      <w:start w:val="1"/>
+      <w:numFmt w:val="bullet"/>
+      <w:lvlText w:val=""/>
+      <w:lvlJc w:val="left"/>
+      <w:pPr>
+        <w:tabs>
+          <w:tab w:val="num" w:pos="4320"/>
+        </w:tabs>
+        <w:ind w:left="4320" w:hanging="360"/>
+      </w:pPr>
+      <w:rPr>
+        <w:rFonts w:ascii="Wingdings" w:hAnsi="Wingdings" w:hint="default"/>
+        <w:sz w:val="20"/>
+      </w:rPr>
+    </w:lvl>
+    <w:lvl w:ilvl="6" w:tentative="1">
+      <w:start w:val="1"/>
+      <w:numFmt w:val="bullet"/>
+      <w:lvlText w:val=""/>
+      <w:lvlJc w:val="left"/>
+      <w:pPr>
+        <w:tabs>
+          <w:tab w:val="num" w:pos="5040"/>
+        </w:tabs>
+        <w:ind w:left="5040" w:hanging="360"/>
+      </w:pPr>
+      <w:rPr>
+        <w:rFonts w:ascii="Wingdings" w:hAnsi="Wingdings" w:hint="default"/>
+        <w:sz w:val="20"/>
+      </w:rPr>
+    </w:lvl>
+    <w:lvl w:ilvl="7" w:tentative="1">
+      <w:start w:val="1"/>
+      <w:numFmt w:val="bullet"/>
+      <w:lvlText w:val=""/>
+      <w:lvlJc w:val="left"/>
+      <w:pPr>
+        <w:tabs>
+          <w:tab w:val="num" w:pos="5760"/>
+        </w:tabs>
+        <w:ind w:left="5760" w:hanging="360"/>
+      </w:pPr>
+      <w:rPr>
+        <w:rFonts w:ascii="Wingdings" w:hAnsi="Wingdings" w:hint="default"/>
+        <w:sz w:val="20"/>
+      </w:rPr>
+    </w:lvl>
+    <w:lvl w:ilvl="8" w:tentative="1">
+      <w:start w:val="1"/>
+      <w:numFmt w:val="bullet"/>
+      <w:lvlText w:val=""/>
+      <w:lvlJc w:val="left"/>
+      <w:pPr>
+        <w:tabs>
+          <w:tab w:val="num" w:pos="6480"/>
+        </w:tabs>
+        <w:ind w:left="6480" w:hanging="360"/>
+      </w:pPr>
+      <w:rPr>
+        <w:rFonts w:ascii="Wingdings" w:hAnsi="Wingdings" w:hint="default"/>
+        <w:sz w:val="20"/>
+      </w:rPr>
+    </w:lvl>
+  </w:abstractNum>
+  <w:num w:numId="1" w16cid:durableId="1440829971">
+    <w:abstractNumId w:val="0"/>
+  </w:num>
+</w:numbering>
 </file>
 
 <file path=word/styles.xml><?xml version="1.0" encoding="utf-8"?>

</xml_diff>